<commit_message>
cambios en el docs de resultados
</commit_message>
<xml_diff>
--- a/Proy2_Eq01_Resultados.docx
+++ b/Proy2_Eq01_Resultados.docx
@@ -406,7 +406,13 @@
               <w:rPr>
                 <w:sz w:val="18"/>
               </w:rPr>
-              <w:t>_NomiCore</w:t>
+              <w:t>_</w:t>
+            </w:r>
+            <w:r>
+              <w:rPr>
+                <w:sz w:val="18"/>
+              </w:rPr>
+              <w:t>CamposPD</w:t>
             </w:r>
           </w:p>
         </w:tc>
@@ -565,6 +571,13 @@
     </w:p>
     <w:sdt>
       <w:sdtPr>
+        <w:rPr>
+          <w:rFonts w:ascii="Calibri" w:eastAsia="Calibri" w:hAnsi="Calibri" w:cs="Times New Roman"/>
+          <w:color w:val="191923"/>
+          <w:sz w:val="22"/>
+          <w:szCs w:val="20"/>
+          <w:lang w:val="es-ES" w:eastAsia="es-ES"/>
+        </w:rPr>
         <w:id w:val="261889211"/>
         <w:docPartObj>
           <w:docPartGallery w:val="Table of Contents"/>
@@ -573,14 +586,9 @@
       </w:sdtPr>
       <w:sdtEndPr>
         <w:rPr>
-          <w:rFonts w:ascii="Calibri" w:eastAsia="Calibri" w:hAnsi="Calibri" w:cs="Times New Roman"/>
           <w:b/>
           <w:bCs/>
           <w:noProof/>
-          <w:color w:val="191923"/>
-          <w:sz w:val="22"/>
-          <w:szCs w:val="20"/>
-          <w:lang w:val="es-ES" w:eastAsia="es-ES"/>
         </w:rPr>
       </w:sdtEndPr>
       <w:sdtContent>
@@ -594,7 +602,6 @@
               <w:color w:val="7030A0"/>
             </w:rPr>
           </w:pPr>
-          <w:proofErr w:type="spellStart"/>
           <w:r>
             <w:rPr>
               <w:rFonts w:asciiTheme="minorHAnsi" w:hAnsiTheme="minorHAnsi" w:cstheme="minorHAnsi"/>
@@ -602,9 +609,8 @@
               <w:bCs/>
               <w:color w:val="7030A0"/>
             </w:rPr>
-            <w:t>Tabla</w:t>
+            <w:t xml:space="preserve">Tabla de </w:t>
           </w:r>
-          <w:proofErr w:type="spellEnd"/>
           <w:r>
             <w:rPr>
               <w:rFonts w:asciiTheme="minorHAnsi" w:hAnsiTheme="minorHAnsi" w:cstheme="minorHAnsi"/>
@@ -612,27 +618,7 @@
               <w:bCs/>
               <w:color w:val="7030A0"/>
             </w:rPr>
-            <w:t xml:space="preserve"> de </w:t>
-          </w:r>
-          <w:proofErr w:type="spellStart"/>
-          <w:r>
-            <w:rPr>
-              <w:rFonts w:asciiTheme="minorHAnsi" w:hAnsiTheme="minorHAnsi" w:cstheme="minorHAnsi"/>
-              <w:b/>
-              <w:bCs/>
-              <w:color w:val="7030A0"/>
-            </w:rPr>
-            <w:t>Contenido</w:t>
-          </w:r>
-          <w:proofErr w:type="spellEnd"/>
-          <w:r>
-            <w:rPr>
-              <w:rFonts w:asciiTheme="minorHAnsi" w:hAnsiTheme="minorHAnsi" w:cstheme="minorHAnsi"/>
-              <w:b/>
-              <w:bCs/>
-              <w:color w:val="7030A0"/>
-            </w:rPr>
-            <w:t xml:space="preserve"> </w:t>
+            <w:t xml:space="preserve">Contenido </w:t>
           </w:r>
         </w:p>
         <w:p>
@@ -2599,6 +2585,7 @@
       </w:pPr>
       <w:bookmarkStart w:id="0" w:name="_Toc233562641"/>
       <w:r>
+        <w:lastRenderedPageBreak/>
         <w:t>1. Descripción del problema</w:t>
       </w:r>
       <w:bookmarkEnd w:id="0"/>
@@ -2609,10 +2596,7 @@
         <w:jc w:val="both"/>
       </w:pPr>
       <w:r>
-        <w:t>En muchas organizaciones pequeñas o medianas, el registro de empleados, la asistencia, el cálculo de pagos y la generación de comprobantes suelen manejarse de forma</w:t>
-      </w:r>
-      <w:r>
-        <w:t xml:space="preserve"> manual o con hojas de cálculo separadas. Este método aumenta el riesgo de errores en salarios, deducciones, horas trabajadas y reportes, además de dificultar la consulta histórica de la información.</w:t>
+        <w:t>En muchas organizaciones pequeñas o medianas, el registro de empleados, la asistencia, el cálculo de pagos y la generación de comprobantes suelen manejarse de forma manual o con hojas de cálculo separadas. Este método aumenta el riesgo de errores en salarios, deducciones, horas trabajadas y reportes, además de dificultar la consulta histórica de la información.</w:t>
       </w:r>
     </w:p>
     <w:p>
@@ -2621,10 +2605,7 @@
         <w:jc w:val="both"/>
       </w:pPr>
       <w:r>
-        <w:t>El problema propuesto consiste en diseñar una aplicación de escritorio que centralice la gestión básica de nómina. La solución desarrollada recibe el nombre de NomiCore — Sistema de Gestión de Nómina y permite administrar empleados, registrar asistencia, calcular nómina, generar comprobantes, imprimir recibos y</w:t>
-      </w:r>
-      <w:r>
-        <w:t xml:space="preserve"> exportar reportes.</w:t>
+        <w:t>El problema propuesto consiste en diseñar una aplicación de escritorio que centralice la gestión básica de nómina. La solución desarrollada recibe el nombre de NomiCore — Sistema de Gestión de Nómina y permite administrar empleados, registrar asistencia, calcular nómina, generar comprobantes, imprimir recibos y exportar reportes.</w:t>
       </w:r>
     </w:p>
     <w:p>
@@ -2652,10 +2633,7 @@
         <w:jc w:val="both"/>
       </w:pPr>
       <w:r>
-        <w:t>Esta sección se incorpora como sustento investigativo del tema asignado. La investigación se basó en documentación oficial de Microsoft Learn, por</w:t>
-      </w:r>
-      <w:r>
-        <w:t>que es la fuente primaria para C#, Windows Forms y la biblioteca System.Drawing.Printing.</w:t>
+        <w:t>Esta sección se incorpora como sustento investigativo del tema asignado. La investigación se basó en documentación oficial de Microsoft Learn, porque es la fuente primaria para C#, Windows Forms y la biblioteca System.Drawing.Printing.</w:t>
       </w:r>
     </w:p>
     <w:p>
@@ -2674,10 +2652,7 @@
         <w:jc w:val="both"/>
       </w:pPr>
       <w:r>
-        <w:t>En C#, un campo es una variable declarada directamente dentro de una clase o estructura. Los campos representan datos internos del objeto y forman parte de los miembros de la clase. En una aplicación orientada a objetos, los campos no deberían exponerse de forma pública cuando contienen datos sensibles o reglas de validación, porque eso permitiría modificar el estado interno del objeto sin cont</w:t>
-      </w:r>
-      <w:r>
-        <w:t>rol.</w:t>
+        <w:t>En C#, un campo es una variable declarada directamente dentro de una clase o estructura. Los campos representan datos internos del objeto y forman parte de los miembros de la clase. En una aplicación orientada a objetos, los campos no deberían exponerse de forma pública cuando contienen datos sensibles o reglas de validación, porque eso permitiría modificar el estado interno del objeto sin control.</w:t>
       </w:r>
     </w:p>
     <w:p>
@@ -2695,28 +2670,14 @@
         <w:spacing w:after="0"/>
         <w:ind w:left="360"/>
         <w:rPr>
-          <w:lang w:val="en-US"/>
-        </w:rPr>
-      </w:pPr>
-      <w:r>
-        <w:rPr>
-          <w:lang w:val="en-US"/>
-        </w:rPr>
-        <w:t xml:space="preserve">private string </w:t>
-      </w:r>
-      <w:proofErr w:type="spellStart"/>
-      <w:r>
-        <w:rPr>
-          <w:lang w:val="en-US"/>
-        </w:rPr>
-        <w:t>nombre</w:t>
-      </w:r>
-      <w:proofErr w:type="spellEnd"/>
-      <w:r>
-        <w:rPr>
-          <w:lang w:val="en-US"/>
-        </w:rPr>
-        <w:t>;</w:t>
+          <w:lang w:val="es-ES"/>
+        </w:rPr>
+      </w:pPr>
+      <w:r>
+        <w:rPr>
+          <w:lang w:val="es-ES"/>
+        </w:rPr>
+        <w:t>private string nombre;</w:t>
       </w:r>
     </w:p>
     <w:p>
@@ -2725,28 +2686,14 @@
         <w:spacing w:after="0"/>
         <w:ind w:left="360"/>
         <w:rPr>
-          <w:lang w:val="en-US"/>
-        </w:rPr>
-      </w:pPr>
-      <w:r>
-        <w:rPr>
-          <w:lang w:val="en-US"/>
-        </w:rPr>
-        <w:t xml:space="preserve">private decimal </w:t>
-      </w:r>
-      <w:proofErr w:type="spellStart"/>
-      <w:r>
-        <w:rPr>
-          <w:lang w:val="en-US"/>
-        </w:rPr>
-        <w:t>salarioBase</w:t>
-      </w:r>
-      <w:proofErr w:type="spellEnd"/>
-      <w:r>
-        <w:rPr>
-          <w:lang w:val="en-US"/>
-        </w:rPr>
-        <w:t>;</w:t>
+          <w:lang w:val="es-ES"/>
+        </w:rPr>
+      </w:pPr>
+      <w:r>
+        <w:rPr>
+          <w:lang w:val="es-ES"/>
+        </w:rPr>
+        <w:t>private decimal salarioBase;</w:t>
       </w:r>
     </w:p>
     <w:p>
@@ -2755,7 +2702,7 @@
         <w:spacing w:after="0"/>
         <w:ind w:left="360"/>
         <w:rPr>
-          <w:lang w:val="en-US"/>
+          <w:lang w:val="es-ES"/>
         </w:rPr>
       </w:pPr>
     </w:p>
@@ -2765,12 +2712,12 @@
         <w:spacing w:after="0"/>
         <w:ind w:left="360"/>
         <w:rPr>
-          <w:lang w:val="en-US"/>
-        </w:rPr>
-      </w:pPr>
-      <w:r>
-        <w:rPr>
-          <w:lang w:val="en-US"/>
+          <w:lang w:val="es-ES"/>
+        </w:rPr>
+      </w:pPr>
+      <w:r>
+        <w:rPr>
+          <w:lang w:val="es-ES"/>
         </w:rPr>
         <w:t>public string Nombre</w:t>
       </w:r>
@@ -2781,12 +2728,12 @@
         <w:spacing w:after="0"/>
         <w:ind w:left="360"/>
         <w:rPr>
-          <w:lang w:val="en-US"/>
-        </w:rPr>
-      </w:pPr>
-      <w:r>
-        <w:rPr>
-          <w:lang w:val="en-US"/>
+          <w:lang w:val="es-ES"/>
+        </w:rPr>
+      </w:pPr>
+      <w:r>
+        <w:rPr>
+          <w:lang w:val="es-ES"/>
         </w:rPr>
         <w:t>{</w:t>
       </w:r>
@@ -2797,45 +2744,15 @@
         <w:spacing w:after="0"/>
         <w:ind w:left="360"/>
         <w:rPr>
-          <w:lang w:val="en-US"/>
-        </w:rPr>
-      </w:pPr>
-      <w:r>
-        <w:rPr>
-          <w:lang w:val="en-US"/>
-        </w:rPr>
-        <w:t xml:space="preserve">    get </w:t>
-      </w:r>
-      <w:proofErr w:type="gramStart"/>
-      <w:r>
-        <w:rPr>
-          <w:lang w:val="en-US"/>
-        </w:rPr>
-        <w:t>{ return</w:t>
-      </w:r>
-      <w:proofErr w:type="gramEnd"/>
-      <w:r>
-        <w:rPr>
-          <w:lang w:val="en-US"/>
-        </w:rPr>
-        <w:t xml:space="preserve"> </w:t>
-      </w:r>
-      <w:proofErr w:type="spellStart"/>
-      <w:r>
-        <w:rPr>
-          <w:lang w:val="en-US"/>
-        </w:rPr>
-        <w:t>nombre</w:t>
-      </w:r>
-      <w:proofErr w:type="spellEnd"/>
-      <w:proofErr w:type="gramStart"/>
-      <w:r>
-        <w:rPr>
-          <w:lang w:val="en-US"/>
-        </w:rPr>
-        <w:t>; }</w:t>
-      </w:r>
-      <w:proofErr w:type="gramEnd"/>
+          <w:lang w:val="es-ES"/>
+        </w:rPr>
+      </w:pPr>
+      <w:r>
+        <w:rPr>
+          <w:lang w:val="es-ES"/>
+        </w:rPr>
+        <w:t xml:space="preserve">    get { return nombre; }</w:t>
+      </w:r>
     </w:p>
     <w:p>
       <w:pPr>
@@ -2845,29 +2762,13 @@
       </w:pPr>
       <w:r>
         <w:rPr>
-          <w:lang w:val="en-US"/>
+          <w:lang w:val="es-ES"/>
         </w:rPr>
         <w:t xml:space="preserve">    </w:t>
       </w:r>
       <w:r>
-        <w:t xml:space="preserve">set </w:t>
-      </w:r>
-      <w:proofErr w:type="gramStart"/>
-      <w:r>
-        <w:t>{ nombre</w:t>
-      </w:r>
-      <w:proofErr w:type="gramEnd"/>
-      <w:r>
-        <w:t xml:space="preserve"> = EntityValida</w:t>
-      </w:r>
-      <w:r>
-        <w:t>tion.NormalizeRequired(value, "El nombre del empleado")</w:t>
-      </w:r>
-      <w:proofErr w:type="gramStart"/>
-      <w:r>
-        <w:t>; }</w:t>
-      </w:r>
-      <w:proofErr w:type="gramEnd"/>
+        <w:t>set { nombre = EntityValidation.NormalizeRequired(value, "El nombre del empleado"); }</w:t>
+      </w:r>
     </w:p>
     <w:p>
       <w:pPr>
@@ -2875,12 +2776,12 @@
         <w:spacing w:after="0"/>
         <w:ind w:left="360"/>
         <w:rPr>
-          <w:lang w:val="en-US"/>
-        </w:rPr>
-      </w:pPr>
-      <w:r>
-        <w:rPr>
-          <w:lang w:val="en-US"/>
+          <w:lang w:val="es-ES"/>
+        </w:rPr>
+      </w:pPr>
+      <w:r>
+        <w:rPr>
+          <w:lang w:val="es-ES"/>
         </w:rPr>
         <w:t>}</w:t>
       </w:r>
@@ -2891,7 +2792,7 @@
         <w:spacing w:after="0"/>
         <w:ind w:left="360"/>
         <w:rPr>
-          <w:lang w:val="en-US"/>
+          <w:lang w:val="es-ES"/>
         </w:rPr>
       </w:pPr>
     </w:p>
@@ -2908,16 +2809,8 @@
         <w:rPr>
           <w:lang w:val="en-US"/>
         </w:rPr>
-        <w:t xml:space="preserve">public decimal </w:t>
-      </w:r>
-      <w:proofErr w:type="spellStart"/>
-      <w:r>
-        <w:rPr>
-          <w:lang w:val="en-US"/>
-        </w:rPr>
-        <w:t>SalarioBase</w:t>
-      </w:r>
-      <w:proofErr w:type="spellEnd"/>
+        <w:t>public decimal SalarioBase</w:t>
+      </w:r>
     </w:p>
     <w:p>
       <w:pPr>
@@ -2948,38 +2841,8 @@
         <w:rPr>
           <w:lang w:val="en-US"/>
         </w:rPr>
-        <w:t xml:space="preserve">    get </w:t>
-      </w:r>
-      <w:proofErr w:type="gramStart"/>
-      <w:r>
-        <w:rPr>
-          <w:lang w:val="en-US"/>
-        </w:rPr>
-        <w:t>{ return</w:t>
-      </w:r>
-      <w:proofErr w:type="gramEnd"/>
-      <w:r>
-        <w:rPr>
-          <w:lang w:val="en-US"/>
-        </w:rPr>
-        <w:t xml:space="preserve"> </w:t>
-      </w:r>
-      <w:proofErr w:type="spellStart"/>
-      <w:r>
-        <w:rPr>
-          <w:lang w:val="en-US"/>
-        </w:rPr>
-        <w:t>salarioBase</w:t>
-      </w:r>
-      <w:proofErr w:type="spellEnd"/>
-      <w:proofErr w:type="gramStart"/>
-      <w:r>
-        <w:rPr>
-          <w:lang w:val="en-US"/>
-        </w:rPr>
-        <w:t>; }</w:t>
-      </w:r>
-      <w:proofErr w:type="gramEnd"/>
+        <w:t xml:space="preserve">    get { return salarioBase; }</w:t>
+      </w:r>
     </w:p>
     <w:p>
       <w:pPr>
@@ -3003,14 +2866,20 @@
         <w:spacing w:after="0"/>
         <w:ind w:left="360"/>
         <w:rPr>
+          <w:lang w:val="es-MX"/>
+        </w:rPr>
+      </w:pPr>
+      <w:r>
+        <w:rPr>
           <w:lang w:val="en-US"/>
         </w:rPr>
-      </w:pPr>
-      <w:r>
-        <w:rPr>
-          <w:lang w:val="en-US"/>
-        </w:rPr>
-        <w:t xml:space="preserve">    {</w:t>
+        <w:t xml:space="preserve">    </w:t>
+      </w:r>
+      <w:r>
+        <w:rPr>
+          <w:lang w:val="es-MX"/>
+        </w:rPr>
+        <w:t>{</w:t>
       </w:r>
     </w:p>
     <w:p>
@@ -3019,42 +2888,14 @@
         <w:spacing w:after="0"/>
         <w:ind w:left="360"/>
         <w:rPr>
-          <w:lang w:val="en-US"/>
-        </w:rPr>
-      </w:pPr>
-      <w:r>
-        <w:rPr>
-          <w:lang w:val="en-US"/>
-        </w:rPr>
-        <w:t xml:space="preserve">        </w:t>
-      </w:r>
-      <w:proofErr w:type="spellStart"/>
-      <w:r>
-        <w:rPr>
-          <w:lang w:val="en-US"/>
-        </w:rPr>
-        <w:t>EntityValidation.RequireNonNegative</w:t>
-      </w:r>
-      <w:proofErr w:type="spellEnd"/>
-      <w:r>
-        <w:rPr>
-          <w:lang w:val="en-US"/>
-        </w:rPr>
-        <w:t xml:space="preserve">(value, "El </w:t>
-      </w:r>
-      <w:proofErr w:type="spellStart"/>
-      <w:r>
-        <w:rPr>
-          <w:lang w:val="en-US"/>
-        </w:rPr>
-        <w:t>salario</w:t>
-      </w:r>
-      <w:proofErr w:type="spellEnd"/>
-      <w:r>
-        <w:rPr>
-          <w:lang w:val="en-US"/>
-        </w:rPr>
-        <w:t xml:space="preserve"> base");</w:t>
+          <w:lang w:val="es-MX"/>
+        </w:rPr>
+      </w:pPr>
+      <w:r>
+        <w:rPr>
+          <w:lang w:val="es-MX"/>
+        </w:rPr>
+        <w:t xml:space="preserve">        EntityValidation.RequireNonNegative(value, "El salario base");</w:t>
       </w:r>
     </w:p>
     <w:p>
@@ -3063,28 +2904,14 @@
         <w:spacing w:after="0"/>
         <w:ind w:left="360"/>
         <w:rPr>
-          <w:lang w:val="en-US"/>
-        </w:rPr>
-      </w:pPr>
-      <w:r>
-        <w:rPr>
-          <w:lang w:val="en-US"/>
-        </w:rPr>
-        <w:t xml:space="preserve">        </w:t>
-      </w:r>
-      <w:proofErr w:type="spellStart"/>
-      <w:r>
-        <w:rPr>
-          <w:lang w:val="en-US"/>
-        </w:rPr>
-        <w:t>salarioBase</w:t>
-      </w:r>
-      <w:proofErr w:type="spellEnd"/>
-      <w:r>
-        <w:rPr>
-          <w:lang w:val="en-US"/>
-        </w:rPr>
-        <w:t xml:space="preserve"> = value;</w:t>
+          <w:lang w:val="es-MX"/>
+        </w:rPr>
+      </w:pPr>
+      <w:r>
+        <w:rPr>
+          <w:lang w:val="es-MX"/>
+        </w:rPr>
+        <w:t xml:space="preserve">        salarioBase = value;</w:t>
       </w:r>
     </w:p>
     <w:p>
@@ -3095,7 +2922,7 @@
       </w:pPr>
       <w:r>
         <w:rPr>
-          <w:lang w:val="en-US"/>
+          <w:lang w:val="es-MX"/>
         </w:rPr>
         <w:t xml:space="preserve">    </w:t>
       </w:r>
@@ -3129,10 +2956,7 @@
         <w:jc w:val="both"/>
       </w:pPr>
       <w:r>
-        <w:t>Las propiedades en C# funcionan como campos inteligentes: desde fuera del objeto se usan de forma parecida a una variable, pero internamente pueden ejecutar lógica adicional, como validación, normalización de texto, contr</w:t>
-      </w:r>
-      <w:r>
-        <w:t>ol de acceso o cálculo derivado. Esto permite aplicar encapsulamiento, que es uno de los principios principales de la Programación Orientada a Objetos.</w:t>
+        <w:t>Las propiedades en C# funcionan como campos inteligentes: desde fuera del objeto se usan de forma parecida a una variable, pero internamente pueden ejecutar lógica adicional, como validación, normalización de texto, control de acceso o cálculo derivado. Esto permite aplicar encapsulamiento, que es uno de los principios principales de la Programación Orientada a Objetos.</w:t>
       </w:r>
     </w:p>
     <w:p>
@@ -3189,38 +3013,8 @@
         <w:rPr>
           <w:lang w:val="en-US"/>
         </w:rPr>
-        <w:t xml:space="preserve">    get </w:t>
-      </w:r>
-      <w:proofErr w:type="gramStart"/>
-      <w:r>
-        <w:rPr>
-          <w:lang w:val="en-US"/>
-        </w:rPr>
-        <w:t>{ return</w:t>
-      </w:r>
-      <w:proofErr w:type="gramEnd"/>
-      <w:r>
-        <w:rPr>
-          <w:lang w:val="en-US"/>
-        </w:rPr>
-        <w:t xml:space="preserve"> </w:t>
-      </w:r>
-      <w:proofErr w:type="spellStart"/>
-      <w:r>
-        <w:rPr>
-          <w:lang w:val="en-US"/>
-        </w:rPr>
-        <w:t>estado</w:t>
-      </w:r>
-      <w:proofErr w:type="spellEnd"/>
-      <w:proofErr w:type="gramStart"/>
-      <w:r>
-        <w:rPr>
-          <w:lang w:val="en-US"/>
-        </w:rPr>
-        <w:t>; }</w:t>
-      </w:r>
-      <w:proofErr w:type="gramEnd"/>
+        <w:t xml:space="preserve">    get { return estado; }</w:t>
+      </w:r>
     </w:p>
     <w:p>
       <w:pPr>
@@ -3244,14 +3038,20 @@
         <w:spacing w:after="0"/>
         <w:ind w:left="360"/>
         <w:rPr>
+          <w:lang w:val="es-MX"/>
+        </w:rPr>
+      </w:pPr>
+      <w:r>
+        <w:rPr>
           <w:lang w:val="en-US"/>
         </w:rPr>
-      </w:pPr>
-      <w:r>
-        <w:rPr>
-          <w:lang w:val="en-US"/>
-        </w:rPr>
-        <w:t xml:space="preserve">    {</w:t>
+        <w:t xml:space="preserve">    </w:t>
+      </w:r>
+      <w:r>
+        <w:rPr>
+          <w:lang w:val="es-MX"/>
+        </w:rPr>
+        <w:t>{</w:t>
       </w:r>
     </w:p>
     <w:p>
@@ -3260,42 +3060,14 @@
         <w:spacing w:after="0"/>
         <w:ind w:left="360"/>
         <w:rPr>
-          <w:lang w:val="en-US"/>
-        </w:rPr>
-      </w:pPr>
-      <w:r>
-        <w:rPr>
-          <w:lang w:val="en-US"/>
-        </w:rPr>
-        <w:t xml:space="preserve">        </w:t>
-      </w:r>
-      <w:proofErr w:type="spellStart"/>
-      <w:r>
-        <w:rPr>
-          <w:lang w:val="en-US"/>
-        </w:rPr>
-        <w:t>estado</w:t>
-      </w:r>
-      <w:proofErr w:type="spellEnd"/>
-      <w:r>
-        <w:rPr>
-          <w:lang w:val="en-US"/>
-        </w:rPr>
-        <w:t xml:space="preserve"> = </w:t>
-      </w:r>
-      <w:proofErr w:type="spellStart"/>
-      <w:r>
-        <w:rPr>
-          <w:lang w:val="en-US"/>
-        </w:rPr>
-        <w:t>EntityValidation.NormalizeAllowedRequired</w:t>
-      </w:r>
-      <w:proofErr w:type="spellEnd"/>
-      <w:r>
-        <w:rPr>
-          <w:lang w:val="en-US"/>
-        </w:rPr>
-        <w:t>(</w:t>
+          <w:lang w:val="es-MX"/>
+        </w:rPr>
+      </w:pPr>
+      <w:r>
+        <w:rPr>
+          <w:lang w:val="es-MX"/>
+        </w:rPr>
+        <w:t xml:space="preserve">        estado = EntityValidation.NormalizeAllowedRequired(</w:t>
       </w:r>
     </w:p>
     <w:p>
@@ -3304,12 +3076,12 @@
         <w:spacing w:after="0"/>
         <w:ind w:left="360"/>
         <w:rPr>
-          <w:lang w:val="en-US"/>
-        </w:rPr>
-      </w:pPr>
-      <w:r>
-        <w:rPr>
-          <w:lang w:val="en-US"/>
+          <w:lang w:val="es-MX"/>
+        </w:rPr>
+      </w:pPr>
+      <w:r>
+        <w:rPr>
+          <w:lang w:val="es-MX"/>
         </w:rPr>
         <w:t xml:space="preserve">            value,</w:t>
       </w:r>
@@ -3322,7 +3094,7 @@
       </w:pPr>
       <w:r>
         <w:rPr>
-          <w:lang w:val="en-US"/>
+          <w:lang w:val="es-MX"/>
         </w:rPr>
         <w:t xml:space="preserve">            </w:t>
       </w:r>
@@ -3366,6 +3138,7 @@
       </w:pPr>
       <w:bookmarkStart w:id="4" w:name="_Toc233562645"/>
       <w:r>
+        <w:lastRenderedPageBreak/>
         <w:t>2.3 PrintDocument en Windows Forms</w:t>
       </w:r>
       <w:bookmarkEnd w:id="4"/>
@@ -3376,10 +3149,7 @@
         <w:jc w:val="both"/>
       </w:pPr>
       <w:r>
-        <w:t>PrintDocument es una clase de System.Drawing.Printing que representa un documento imprimible en aplicaciones Windows Forms. El flujo común consiste en crear una instancia de PrintDocument, configurar sus propiedades, llamar al método de impresión o vista previa y contro</w:t>
-      </w:r>
-      <w:r>
-        <w:t>lar el evento PrintPage, donde se dibuja el contenido de cada página.</w:t>
+        <w:t>PrintDocument es una clase de System.Drawing.Printing que representa un documento imprimible en aplicaciones Windows Forms. El flujo común consiste en crear una instancia de PrintDocument, configurar sus propiedades, llamar al método de impresión o vista previa y controlar el evento PrintPage, donde se dibuja el contenido de cada página.</w:t>
       </w:r>
     </w:p>
     <w:p>
@@ -3397,10 +3167,7 @@
         <w:jc w:val="both"/>
       </w:pPr>
       <w:r>
-        <w:t>El evento PrintPage utiliza el objeto Graphics para dibujar el reci</w:t>
-      </w:r>
-      <w:r>
-        <w:t>bo: título, número de comprobante, empleado, periodo, fecha, ingresos, deducciones, neto a pagar y firma autorizada. Esta implementación demuestra que la aplicación no solo muestra datos en pantalla, sino que también genera una salida formal imprimible.</w:t>
+        <w:t>El evento PrintPage utiliza el objeto Graphics para dibujar el recibo: título, número de comprobante, empleado, periodo, fecha, ingresos, deducciones, neto a pagar y firma autorizada. Esta implementación demuestra que la aplicación no solo muestra datos en pantalla, sino que también genera una salida formal imprimible.</w:t>
       </w:r>
     </w:p>
     <w:p>
@@ -3416,71 +3183,7 @@
         <w:rPr>
           <w:lang w:val="en-US"/>
         </w:rPr>
-        <w:t xml:space="preserve">private </w:t>
-      </w:r>
-      <w:proofErr w:type="spellStart"/>
-      <w:r>
-        <w:rPr>
-          <w:lang w:val="en-US"/>
-        </w:rPr>
-        <w:t>readonly</w:t>
-      </w:r>
-      <w:proofErr w:type="spellEnd"/>
-      <w:r>
-        <w:rPr>
-          <w:lang w:val="en-US"/>
-        </w:rPr>
-        <w:t xml:space="preserve"> </w:t>
-      </w:r>
-      <w:proofErr w:type="spellStart"/>
-      <w:r>
-        <w:rPr>
-          <w:lang w:val="en-US"/>
-        </w:rPr>
-        <w:t>PrintDocument</w:t>
-      </w:r>
-      <w:proofErr w:type="spellEnd"/>
-      <w:r>
-        <w:rPr>
-          <w:lang w:val="en-US"/>
-        </w:rPr>
-        <w:t xml:space="preserve"> </w:t>
-      </w:r>
-      <w:proofErr w:type="spellStart"/>
-      <w:r>
-        <w:rPr>
-          <w:lang w:val="en-US"/>
-        </w:rPr>
-        <w:t>printDocument</w:t>
-      </w:r>
-      <w:proofErr w:type="spellEnd"/>
-      <w:r>
-        <w:rPr>
-          <w:lang w:val="en-US"/>
-        </w:rPr>
-        <w:t xml:space="preserve"> = new </w:t>
-      </w:r>
-      <w:proofErr w:type="spellStart"/>
-      <w:proofErr w:type="gramStart"/>
-      <w:r>
-        <w:rPr>
-          <w:lang w:val="en-US"/>
-        </w:rPr>
-        <w:t>PrintDocument</w:t>
-      </w:r>
-      <w:proofErr w:type="spellEnd"/>
-      <w:r>
-        <w:rPr>
-          <w:lang w:val="en-US"/>
-        </w:rPr>
-        <w:t>(</w:t>
-      </w:r>
-      <w:proofErr w:type="gramEnd"/>
-      <w:r>
-        <w:rPr>
-          <w:lang w:val="en-US"/>
-        </w:rPr>
-        <w:t>);</w:t>
+        <w:t>private readonly PrintDocument printDocument = new PrintDocument();</w:t>
       </w:r>
     </w:p>
     <w:p>
@@ -3506,49 +3209,7 @@
         <w:rPr>
           <w:lang w:val="en-US"/>
         </w:rPr>
-        <w:t xml:space="preserve">private void </w:t>
-      </w:r>
-      <w:proofErr w:type="spellStart"/>
-      <w:r>
-        <w:rPr>
-          <w:lang w:val="en-US"/>
-        </w:rPr>
-        <w:t>btnImprimir_</w:t>
-      </w:r>
-      <w:proofErr w:type="gramStart"/>
-      <w:r>
-        <w:rPr>
-          <w:lang w:val="en-US"/>
-        </w:rPr>
-        <w:t>Click</w:t>
-      </w:r>
-      <w:proofErr w:type="spellEnd"/>
-      <w:r>
-        <w:rPr>
-          <w:lang w:val="en-US"/>
-        </w:rPr>
-        <w:t>(</w:t>
-      </w:r>
-      <w:proofErr w:type="gramEnd"/>
-      <w:r>
-        <w:rPr>
-          <w:lang w:val="en-US"/>
-        </w:rPr>
-        <w:t xml:space="preserve">object sender, </w:t>
-      </w:r>
-      <w:proofErr w:type="spellStart"/>
-      <w:r>
-        <w:rPr>
-          <w:lang w:val="en-US"/>
-        </w:rPr>
-        <w:t>EventArgs</w:t>
-      </w:r>
-      <w:proofErr w:type="spellEnd"/>
-      <w:r>
-        <w:rPr>
-          <w:lang w:val="en-US"/>
-        </w:rPr>
-        <w:t xml:space="preserve"> e)</w:t>
+        <w:t>private void btnImprimir_Click(object sender, EventArgs e)</w:t>
       </w:r>
     </w:p>
     <w:p>
@@ -3580,29 +3241,7 @@
         <w:rPr>
           <w:lang w:val="en-US"/>
         </w:rPr>
-        <w:t xml:space="preserve">    if </w:t>
-      </w:r>
-      <w:proofErr w:type="gramStart"/>
-      <w:r>
-        <w:rPr>
-          <w:lang w:val="en-US"/>
-        </w:rPr>
-        <w:t>(!</w:t>
-      </w:r>
-      <w:proofErr w:type="spellStart"/>
-      <w:r>
-        <w:rPr>
-          <w:lang w:val="en-US"/>
-        </w:rPr>
-        <w:t>EnsureSelected</w:t>
-      </w:r>
-      <w:proofErr w:type="spellEnd"/>
-      <w:proofErr w:type="gramEnd"/>
-      <w:r>
-        <w:rPr>
-          <w:lang w:val="en-US"/>
-        </w:rPr>
-        <w:t>()) return;</w:t>
+        <w:t xml:space="preserve">    if (!EnsureSelected()) return;</w:t>
       </w:r>
     </w:p>
     <w:p>
@@ -3628,43 +3267,7 @@
         <w:rPr>
           <w:lang w:val="en-US"/>
         </w:rPr>
-        <w:t xml:space="preserve">    using (</w:t>
-      </w:r>
-      <w:proofErr w:type="spellStart"/>
-      <w:r>
-        <w:rPr>
-          <w:lang w:val="en-US"/>
-        </w:rPr>
-        <w:t>PrintPreviewDialog</w:t>
-      </w:r>
-      <w:proofErr w:type="spellEnd"/>
-      <w:r>
-        <w:rPr>
-          <w:lang w:val="en-US"/>
-        </w:rPr>
-        <w:t xml:space="preserve"> preview = new </w:t>
-      </w:r>
-      <w:proofErr w:type="spellStart"/>
-      <w:proofErr w:type="gramStart"/>
-      <w:r>
-        <w:rPr>
-          <w:lang w:val="en-US"/>
-        </w:rPr>
-        <w:t>PrintPreviewDialog</w:t>
-      </w:r>
-      <w:proofErr w:type="spellEnd"/>
-      <w:r>
-        <w:rPr>
-          <w:lang w:val="en-US"/>
-        </w:rPr>
-        <w:t>(</w:t>
-      </w:r>
-      <w:proofErr w:type="gramEnd"/>
-      <w:r>
-        <w:rPr>
-          <w:lang w:val="en-US"/>
-        </w:rPr>
-        <w:t>))</w:t>
+        <w:t xml:space="preserve">    using (PrintPreviewDialog preview = new PrintPreviewDialog())</w:t>
       </w:r>
     </w:p>
     <w:p>
@@ -3696,43 +3299,7 @@
         <w:rPr>
           <w:lang w:val="en-US"/>
         </w:rPr>
-        <w:t xml:space="preserve">        </w:t>
-      </w:r>
-      <w:proofErr w:type="spellStart"/>
-      <w:proofErr w:type="gramStart"/>
-      <w:r>
-        <w:rPr>
-          <w:lang w:val="en-US"/>
-        </w:rPr>
-        <w:t>preview.Docu</w:t>
-      </w:r>
-      <w:r>
-        <w:rPr>
-          <w:lang w:val="en-US"/>
-        </w:rPr>
-        <w:t>ment</w:t>
-      </w:r>
-      <w:proofErr w:type="spellEnd"/>
-      <w:proofErr w:type="gramEnd"/>
-      <w:r>
-        <w:rPr>
-          <w:lang w:val="en-US"/>
-        </w:rPr>
-        <w:t xml:space="preserve"> = </w:t>
-      </w:r>
-      <w:proofErr w:type="spellStart"/>
-      <w:r>
-        <w:rPr>
-          <w:lang w:val="en-US"/>
-        </w:rPr>
-        <w:t>printDocument</w:t>
-      </w:r>
-      <w:proofErr w:type="spellEnd"/>
-      <w:r>
-        <w:rPr>
-          <w:lang w:val="en-US"/>
-        </w:rPr>
-        <w:t>;</w:t>
+        <w:t xml:space="preserve">        preview.Document = printDocument;</w:t>
       </w:r>
     </w:p>
     <w:p>
@@ -3748,23 +3315,7 @@
         <w:rPr>
           <w:lang w:val="en-US"/>
         </w:rPr>
-        <w:t xml:space="preserve">        </w:t>
-      </w:r>
-      <w:proofErr w:type="spellStart"/>
-      <w:proofErr w:type="gramStart"/>
-      <w:r>
-        <w:rPr>
-          <w:lang w:val="en-US"/>
-        </w:rPr>
-        <w:t>preview.ShowDialog</w:t>
-      </w:r>
-      <w:proofErr w:type="spellEnd"/>
-      <w:proofErr w:type="gramEnd"/>
-      <w:r>
-        <w:rPr>
-          <w:lang w:val="en-US"/>
-        </w:rPr>
-        <w:t>(this);</w:t>
+        <w:t xml:space="preserve">        preview.ShowDialog(this);</w:t>
       </w:r>
     </w:p>
     <w:p>
@@ -3822,49 +3373,7 @@
         <w:rPr>
           <w:lang w:val="en-US"/>
         </w:rPr>
-        <w:t xml:space="preserve">private void </w:t>
-      </w:r>
-      <w:proofErr w:type="spellStart"/>
-      <w:r>
-        <w:rPr>
-          <w:lang w:val="en-US"/>
-        </w:rPr>
-        <w:t>PrintDocument_</w:t>
-      </w:r>
-      <w:proofErr w:type="gramStart"/>
-      <w:r>
-        <w:rPr>
-          <w:lang w:val="en-US"/>
-        </w:rPr>
-        <w:t>PrintPage</w:t>
-      </w:r>
-      <w:proofErr w:type="spellEnd"/>
-      <w:r>
-        <w:rPr>
-          <w:lang w:val="en-US"/>
-        </w:rPr>
-        <w:t>(</w:t>
-      </w:r>
-      <w:proofErr w:type="gramEnd"/>
-      <w:r>
-        <w:rPr>
-          <w:lang w:val="en-US"/>
-        </w:rPr>
-        <w:t xml:space="preserve">object sender, </w:t>
-      </w:r>
-      <w:proofErr w:type="spellStart"/>
-      <w:r>
-        <w:rPr>
-          <w:lang w:val="en-US"/>
-        </w:rPr>
-        <w:t>PrintPageEventArgs</w:t>
-      </w:r>
-      <w:proofErr w:type="spellEnd"/>
-      <w:r>
-        <w:rPr>
-          <w:lang w:val="en-US"/>
-        </w:rPr>
-        <w:t xml:space="preserve"> e)</w:t>
+        <w:t>private void PrintDocument_PrintPage(object sender, PrintPageEventArgs e)</w:t>
       </w:r>
     </w:p>
     <w:p>
@@ -3896,81 +3405,7 @@
         <w:rPr>
           <w:lang w:val="en-US"/>
         </w:rPr>
-        <w:t xml:space="preserve">    </w:t>
-      </w:r>
-      <w:proofErr w:type="spellStart"/>
-      <w:proofErr w:type="gramStart"/>
-      <w:r>
-        <w:rPr>
-          <w:lang w:val="en-US"/>
-        </w:rPr>
-        <w:t>e.Graphics.DrawString</w:t>
-      </w:r>
-      <w:proofErr w:type="spellEnd"/>
-      <w:proofErr w:type="gramEnd"/>
-      <w:r>
-        <w:rPr>
-          <w:lang w:val="en-US"/>
-        </w:rPr>
-        <w:t>("</w:t>
-      </w:r>
-      <w:proofErr w:type="spellStart"/>
-      <w:r>
-        <w:rPr>
-          <w:lang w:val="en-US"/>
-        </w:rPr>
-        <w:t>Comprobante</w:t>
-      </w:r>
-      <w:proofErr w:type="spellEnd"/>
-      <w:r>
-        <w:rPr>
-          <w:lang w:val="en-US"/>
-        </w:rPr>
-        <w:t xml:space="preserve"> de Pago", </w:t>
-      </w:r>
-      <w:proofErr w:type="spellStart"/>
-      <w:r>
-        <w:rPr>
-          <w:lang w:val="en-US"/>
-        </w:rPr>
-        <w:t>headerFont</w:t>
-      </w:r>
-      <w:proofErr w:type="spellEnd"/>
-      <w:r>
-        <w:rPr>
-          <w:lang w:val="en-US"/>
-        </w:rPr>
-        <w:t xml:space="preserve">, </w:t>
-      </w:r>
-      <w:proofErr w:type="spellStart"/>
-      <w:r>
-        <w:rPr>
-          <w:lang w:val="en-US"/>
-        </w:rPr>
-        <w:t>Brushes.Black</w:t>
-      </w:r>
-      <w:proofErr w:type="spellEnd"/>
-      <w:r>
-        <w:rPr>
-          <w:lang w:val="en-US"/>
-        </w:rPr>
-        <w:t xml:space="preserve">, </w:t>
-      </w:r>
-      <w:proofErr w:type="spellStart"/>
-      <w:proofErr w:type="gramStart"/>
-      <w:r>
-        <w:rPr>
-          <w:lang w:val="en-US"/>
-        </w:rPr>
-        <w:t>bounds.Left</w:t>
-      </w:r>
-      <w:proofErr w:type="spellEnd"/>
-      <w:proofErr w:type="gramEnd"/>
-      <w:r>
-        <w:rPr>
-          <w:lang w:val="en-US"/>
-        </w:rPr>
-        <w:t>, y);</w:t>
+        <w:t xml:space="preserve">    e.Graphics.DrawString("Comprobante de Pago", headerFont, Brushes.Black, bounds.Left, y);</w:t>
       </w:r>
     </w:p>
     <w:p>
@@ -4073,10 +3508,7 @@
         <w:jc w:val="both"/>
       </w:pPr>
       <w:r>
-        <w:t>La metodología seguida fue incremental: primero se identificó el problema, luego se def</w:t>
-      </w:r>
-      <w:r>
-        <w:t>inieron los módulos, se diseñaron las clases, se implementaron los formularios, se conectó la base de datos local, se agregaron validaciones y finalmente se documentaron los resultados.</w:t>
+        <w:t>La metodología seguida fue incremental: primero se identificó el problema, luego se definieron los módulos, se diseñaron las clases, se implementaron los formularios, se conectó la base de datos local, se agregaron validaciones y finalmente se documentaron los resultados.</w:t>
       </w:r>
     </w:p>
     <w:p>
@@ -4103,10 +3535,7 @@
         <w:ind w:left="360"/>
       </w:pPr>
       <w:r>
-        <w:t>3. Implementación de interfaz: se crearon formularios Windows Forms con diseño oscuro, nav</w:t>
-      </w:r>
-      <w:r>
-        <w:t>egación lateral, tablas y botones funcionales.</w:t>
+        <w:t>3. Implementación de interfaz: se crearon formularios Windows Forms con diseño oscuro, navegación lateral, tablas y botones funcionales.</w:t>
       </w:r>
     </w:p>
     <w:p>
@@ -4142,10 +3571,8 @@
         <w:ind w:left="360"/>
       </w:pPr>
       <w:r>
-        <w:t>7. Pruebas: se prepararon datos representativos</w:t>
-      </w:r>
-      <w:r>
-        <w:t xml:space="preserve"> y una lista de capturas requeridas para evidenciar la ejecución.</w:t>
+        <w:lastRenderedPageBreak/>
+        <w:t>7. Pruebas: se prepararon datos representativos y una lista de capturas requeridas para evidenciar la ejecución.</w:t>
       </w:r>
     </w:p>
     <w:p>
@@ -4280,13 +3707,7 @@
               <w:rPr>
                 <w:sz w:val="18"/>
               </w:rPr>
-              <w:t>Usuarios, departamentos, emp</w:t>
-            </w:r>
-            <w:r>
-              <w:rPr>
-                <w:sz w:val="18"/>
-              </w:rPr>
-              <w:t>leados, asistencia, periodos de nómina, detalles de pago, comprobantes y reportes.</w:t>
+              <w:t>Usuarios, departamentos, empleados, asistencia, periodos de nómina, detalles de pago, comprobantes y reportes.</w:t>
             </w:r>
           </w:p>
         </w:tc>
@@ -4467,13 +3888,7 @@
               <w:rPr>
                 <w:sz w:val="18"/>
               </w:rPr>
-              <w:t>Validar credenciales contra</w:t>
-            </w:r>
-            <w:r>
-              <w:rPr>
-                <w:sz w:val="18"/>
-              </w:rPr>
-              <w:t xml:space="preserve"> la base local SQLite.</w:t>
+              <w:t>Validar credenciales contra la base local SQLite.</w:t>
             </w:r>
           </w:p>
         </w:tc>
@@ -4634,13 +4049,7 @@
               <w:rPr>
                 <w:sz w:val="18"/>
               </w:rPr>
-              <w:t>Detalle de nómina por empleado y total</w:t>
-            </w:r>
-            <w:r>
-              <w:rPr>
-                <w:sz w:val="18"/>
-              </w:rPr>
-              <w:t>es generales.</w:t>
+              <w:t>Detalle de nómina por empleado y totales generales.</w:t>
             </w:r>
           </w:p>
         </w:tc>
@@ -4883,47 +4292,13 @@
                 <w:lang w:val="en-US"/>
               </w:rPr>
             </w:pPr>
-            <w:proofErr w:type="spellStart"/>
             <w:r>
               <w:rPr>
                 <w:sz w:val="18"/>
                 <w:lang w:val="en-US"/>
               </w:rPr>
-              <w:t>TextBox</w:t>
-            </w:r>
-            <w:proofErr w:type="spellEnd"/>
-            <w:r>
-              <w:rPr>
-                <w:sz w:val="18"/>
-                <w:lang w:val="en-US"/>
-              </w:rPr>
-              <w:t xml:space="preserve">, </w:t>
-            </w:r>
-            <w:proofErr w:type="spellStart"/>
-            <w:r>
-              <w:rPr>
-                <w:sz w:val="18"/>
-                <w:lang w:val="en-US"/>
-              </w:rPr>
-              <w:t>CheckBox</w:t>
-            </w:r>
-            <w:proofErr w:type="spellEnd"/>
-            <w:r>
-              <w:rPr>
-                <w:sz w:val="18"/>
-                <w:lang w:val="en-US"/>
-              </w:rPr>
-              <w:t xml:space="preserve">, Button, Label, </w:t>
-            </w:r>
-            <w:proofErr w:type="spellStart"/>
-            <w:r>
-              <w:rPr>
-                <w:sz w:val="18"/>
-                <w:lang w:val="en-US"/>
-              </w:rPr>
-              <w:t>PictureBox</w:t>
-            </w:r>
-            <w:proofErr w:type="spellEnd"/>
+              <w:t>TextBox, CheckBox, Button, Label, PictureBox</w:t>
+            </w:r>
           </w:p>
         </w:tc>
         <w:tc>
@@ -4932,19 +4307,11 @@
             <w:vAlign w:val="center"/>
           </w:tcPr>
           <w:p>
-            <w:proofErr w:type="gramStart"/>
-            <w:r>
-              <w:rPr>
-                <w:sz w:val="18"/>
-              </w:rPr>
-              <w:t>Click</w:t>
-            </w:r>
-            <w:proofErr w:type="gramEnd"/>
-            <w:r>
-              <w:rPr>
-                <w:sz w:val="18"/>
-              </w:rPr>
-              <w:t xml:space="preserve"> en Iniciar sesión.</w:t>
+            <w:r>
+              <w:rPr>
+                <w:sz w:val="18"/>
+              </w:rPr>
+              <w:t>Click en Iniciar sesión.</w:t>
             </w:r>
           </w:p>
         </w:tc>
@@ -4979,13 +4346,7 @@
               <w:rPr>
                 <w:sz w:val="18"/>
               </w:rPr>
-              <w:t>Ventana principal con navegació</w:t>
-            </w:r>
-            <w:r>
-              <w:rPr>
-                <w:sz w:val="18"/>
-              </w:rPr>
-              <w:t>n lateral.</w:t>
+              <w:t>Ventana principal con navegación lateral.</w:t>
             </w:r>
           </w:p>
         </w:tc>
@@ -5551,10 +4912,7 @@
         <w:jc w:val="both"/>
       </w:pPr>
       <w:r>
-        <w:t>La estructura del proyecto responde a la separación solicitada en la guía. La interfaz se ubica en UI, las entidades en Models, la lógica en Services, el acceso a datos en Data y la</w:t>
-      </w:r>
-      <w:r>
-        <w:t>s utilidades en Helpers.</w:t>
+        <w:t>La estructura del proyecto responde a la separación solicitada en la guía. La interfaz se ubica en UI, las entidades en Models, la lógica en Services, el acceso a datos en Data y las utilidades en Helpers.</w:t>
       </w:r>
     </w:p>
     <w:p>
@@ -5565,6 +4923,7 @@
         <w:rPr>
           <w:noProof/>
         </w:rPr>
+        <w:lastRenderedPageBreak/>
         <w:drawing>
           <wp:inline distT="0" distB="0" distL="0" distR="0" wp14:anchorId="5D2AA1F1" wp14:editId="479382C7">
             <wp:extent cx="5943600" cy="3820886"/>
@@ -5864,13 +5223,7 @@
               <w:rPr>
                 <w:sz w:val="18"/>
               </w:rPr>
-              <w:t>Agrupa totales y detalles de una</w:t>
-            </w:r>
-            <w:r>
-              <w:rPr>
-                <w:sz w:val="18"/>
-              </w:rPr>
-              <w:t xml:space="preserve"> nómina calculada.</w:t>
+              <w:t>Agrupa totales y detalles de una nómina calculada.</w:t>
             </w:r>
           </w:p>
         </w:tc>
@@ -6041,10 +5394,7 @@
         <w:jc w:val="both"/>
       </w:pPr>
       <w:r>
-        <w:t xml:space="preserve">La Programación Orientada a Objetos se aplica porque el sistema representa entidades reales mediante clases y objetos. Cada empleado, asistencia, nómina o </w:t>
-      </w:r>
-      <w:r>
-        <w:t>comprobante se modela con una clase que contiene datos y reglas asociadas.</w:t>
+        <w:t>La Programación Orientada a Objetos se aplica porque el sistema representa entidades reales mediante clases y objetos. Cada empleado, asistencia, nómina o comprobante se modela con una clase que contiene datos y reglas asociadas.</w:t>
       </w:r>
     </w:p>
     <w:tbl>
@@ -6228,13 +5578,7 @@
               <w:rPr>
                 <w:sz w:val="18"/>
               </w:rPr>
-              <w:t>Los helpers y servicios</w:t>
-            </w:r>
-            <w:r>
-              <w:rPr>
-                <w:sz w:val="18"/>
-              </w:rPr>
-              <w:t xml:space="preserve"> se reutilizan en varios módulos para validar, aplicar estilos, crear rutas y exportar datos.</w:t>
+              <w:t>Los helpers y servicios se reutilizan en varios módulos para validar, aplicar estilos, crear rutas y exportar datos.</w:t>
             </w:r>
           </w:p>
         </w:tc>
@@ -6508,13 +5852,7 @@
               <w:rPr>
                 <w:sz w:val="18"/>
               </w:rPr>
-              <w:t>Ejecutar consultas, insertar, actualizar y leer da</w:t>
-            </w:r>
-            <w:r>
-              <w:rPr>
-                <w:sz w:val="18"/>
-              </w:rPr>
-              <w:t>tos.</w:t>
+              <w:t>Ejecutar consultas, insertar, actualizar y leer datos.</w:t>
             </w:r>
           </w:p>
         </w:tc>
@@ -6583,6 +5921,7 @@
       </w:pPr>
       <w:bookmarkStart w:id="12" w:name="_Toc233562653"/>
       <w:r>
+        <w:lastRenderedPageBreak/>
         <w:t>10. Diagramas</w:t>
       </w:r>
       <w:bookmarkEnd w:id="12"/>
@@ -6651,10 +5990,7 @@
         <w:jc w:val="both"/>
       </w:pPr>
       <w:r>
-        <w:t>El diagrama se mantiene simplificado para sustentación. No incluye todos los atributos de cada clase, sino las relaciones esenciales: formularios consumen servicios, servi</w:t>
-      </w:r>
-      <w:r>
-        <w:t>cios usan repositorios, repositorios acceden a SQLite y las entidades representan el dominio de nómina.</w:t>
+        <w:t>El diagrama se mantiene simplificado para sustentación. No incluye todos los atributos de cada clase, sino las relaciones esenciales: formularios consumen servicios, servicios usan repositorios, repositorios acceden a SQLite y las entidades representan el dominio de nómina.</w:t>
       </w:r>
     </w:p>
     <w:p>
@@ -6789,13 +6125,7 @@
               <w:rPr>
                 <w:sz w:val="18"/>
               </w:rPr>
-              <w:t>Muestr</w:t>
-            </w:r>
-            <w:r>
-              <w:rPr>
-                <w:sz w:val="18"/>
-              </w:rPr>
-              <w:t>a una pantalla principal con navegación hacia los módulos.</w:t>
+              <w:t>Muestra una pantalla principal con navegación hacia los módulos.</w:t>
             </w:r>
           </w:p>
         </w:tc>
@@ -6999,13 +6329,7 @@
               <w:rPr>
                 <w:sz w:val="18"/>
               </w:rPr>
-              <w:t>Permite ajustar parámetr</w:t>
-            </w:r>
-            <w:r>
-              <w:rPr>
-                <w:sz w:val="18"/>
-              </w:rPr>
-              <w:t>os y generar respaldo.</w:t>
+              <w:t>Permite ajustar parámetros y generar respaldo.</w:t>
             </w:r>
           </w:p>
         </w:tc>
@@ -7288,13 +6612,7 @@
               <w:rPr>
                 <w:sz w:val="18"/>
               </w:rPr>
-              <w:t>Usuario</w:t>
-            </w:r>
-            <w:r>
-              <w:rPr>
-                <w:sz w:val="18"/>
-              </w:rPr>
-              <w:t xml:space="preserve"> vacío o contraseña incorrecta</w:t>
+              <w:t>Usuario vacío o contraseña incorrecta</w:t>
             </w:r>
           </w:p>
         </w:tc>
@@ -7574,6 +6892,7 @@
               <w:rPr>
                 <w:sz w:val="18"/>
               </w:rPr>
+              <w:lastRenderedPageBreak/>
               <w:t>6</w:t>
             </w:r>
           </w:p>
@@ -7604,13 +6923,7 @@
               <w:rPr>
                 <w:sz w:val="18"/>
               </w:rPr>
-              <w:t>Tardanza, entrada 08:45, sal</w:t>
-            </w:r>
-            <w:r>
-              <w:rPr>
-                <w:sz w:val="18"/>
-              </w:rPr>
-              <w:t>ida 17:00</w:t>
+              <w:t>Tardanza, entrada 08:45, salida 17:00</w:t>
             </w:r>
           </w:p>
         </w:tc>
@@ -7935,13 +7248,7 @@
               <w:rPr>
                 <w:sz w:val="18"/>
               </w:rPr>
-              <w:t>Se a</w:t>
-            </w:r>
-            <w:r>
-              <w:rPr>
-                <w:sz w:val="18"/>
-              </w:rPr>
-              <w:t>bre vista previa PrintPreviewDialog.</w:t>
+              <w:t>Se abre vista previa PrintPreviewDialog.</w:t>
             </w:r>
           </w:p>
         </w:tc>
@@ -8143,10 +7450,7 @@
         <w:ind w:left="360"/>
       </w:pPr>
       <w:r>
-        <w:t>• Validaciones en formularios, servicios y entidad</w:t>
-      </w:r>
-      <w:r>
-        <w:t>es para evitar datos vacíos, negativos o inconsistentes.</w:t>
+        <w:t>• Validaciones en formularios, servicios y entidades para evitar datos vacíos, negativos o inconsistentes.</w:t>
       </w:r>
     </w:p>
     <w:p>
@@ -8200,10 +7504,7 @@
         <w:ind w:left="360"/>
       </w:pPr>
       <w:r>
-        <w:t>• Comentarios breves en cálculos de nómin</w:t>
-      </w:r>
-      <w:r>
-        <w:t>a, generación de comprobantes, impresión y lógica relevante.</w:t>
+        <w:t>• Comentarios breves en cálculos de nómina, generación de comprobantes, impresión y lógica relevante.</w:t>
       </w:r>
     </w:p>
     <w:p>
@@ -8304,15 +7605,7 @@
           <w:color w:val="555069"/>
           <w:sz w:val="18"/>
         </w:rPr>
-        <w:t>Figura 4. Captura disponib</w:t>
-      </w:r>
-      <w:r>
-        <w:rPr>
-          <w:i/>
-          <w:color w:val="555069"/>
-          <w:sz w:val="18"/>
-        </w:rPr>
-        <w:t>le del encabezado visual de NomiCore en la pantalla de inicio de sesión.</w:t>
+        <w:t>Figura 4. Captura disponible del encabezado visual de NomiCore en la pantalla de inicio de sesión.</w:t>
       </w:r>
     </w:p>
     <w:p>
@@ -8387,6 +7680,7 @@
         <w:rPr>
           <w:noProof/>
         </w:rPr>
+        <w:lastRenderedPageBreak/>
         <w:drawing>
           <wp:inline distT="0" distB="0" distL="0" distR="0" wp14:anchorId="0A412712" wp14:editId="1B2DE48A">
             <wp:extent cx="3866999" cy="2173605"/>
@@ -8452,7 +7746,7 @@
           <w:noProof/>
         </w:rPr>
         <w:drawing>
-          <wp:inline distT="0" distB="0" distL="0" distR="0" wp14:anchorId="3A146532" wp14:editId="5006218C">
+          <wp:inline distT="0" distB="0" distL="0" distR="0" wp14:anchorId="3A146532" wp14:editId="4614A042">
             <wp:extent cx="4721061" cy="2653665"/>
             <wp:effectExtent l="0" t="0" r="3810" b="0"/>
             <wp:docPr id="1324851673" name="Imagen 5"/>
@@ -8516,7 +7810,7 @@
           <w:noProof/>
         </w:rPr>
         <w:drawing>
-          <wp:inline distT="0" distB="0" distL="0" distR="0" wp14:anchorId="122E7607" wp14:editId="65217804">
+          <wp:inline distT="0" distB="0" distL="0" distR="0" wp14:anchorId="122E7607" wp14:editId="5AAD514B">
             <wp:extent cx="4870182" cy="2737485"/>
             <wp:effectExtent l="0" t="0" r="6985" b="5715"/>
             <wp:docPr id="1576010347" name="Imagen 6"/>
@@ -8580,7 +7874,7 @@
           <w:noProof/>
         </w:rPr>
         <w:drawing>
-          <wp:inline distT="0" distB="0" distL="0" distR="0" wp14:anchorId="6B392818" wp14:editId="13595513">
+          <wp:inline distT="0" distB="0" distL="0" distR="0" wp14:anchorId="6B392818" wp14:editId="231AEAC5">
             <wp:extent cx="5168426" cy="2905125"/>
             <wp:effectExtent l="0" t="0" r="0" b="0"/>
             <wp:docPr id="1424442443" name="Imagen 7"/>
@@ -8643,8 +7937,9 @@
         <w:rPr>
           <w:noProof/>
         </w:rPr>
+        <w:lastRenderedPageBreak/>
         <w:drawing>
-          <wp:inline distT="0" distB="0" distL="0" distR="0" wp14:anchorId="5841405F" wp14:editId="6E6427D7">
+          <wp:inline distT="0" distB="0" distL="0" distR="0" wp14:anchorId="5841405F" wp14:editId="55E3E6D2">
             <wp:extent cx="4969510" cy="2793316"/>
             <wp:effectExtent l="0" t="0" r="2540" b="7620"/>
             <wp:docPr id="490926770" name="Imagen 11"/>
@@ -8708,7 +8003,7 @@
           <w:noProof/>
         </w:rPr>
         <w:drawing>
-          <wp:inline distT="0" distB="0" distL="0" distR="0" wp14:anchorId="1B9F6B24" wp14:editId="62804857">
+          <wp:inline distT="0" distB="0" distL="0" distR="0" wp14:anchorId="1B9F6B24" wp14:editId="39BE5587">
             <wp:extent cx="5114200" cy="2874645"/>
             <wp:effectExtent l="0" t="0" r="0" b="1905"/>
             <wp:docPr id="1166487394" name="Imagen 10"/>
@@ -8772,7 +8067,7 @@
           <w:noProof/>
         </w:rPr>
         <w:drawing>
-          <wp:inline distT="0" distB="0" distL="0" distR="0" wp14:anchorId="43E1778F" wp14:editId="2E50880E">
+          <wp:inline distT="0" distB="0" distL="0" distR="0" wp14:anchorId="43E1778F" wp14:editId="3A3FB98E">
             <wp:extent cx="5181983" cy="2912745"/>
             <wp:effectExtent l="0" t="0" r="0" b="1905"/>
             <wp:docPr id="1598982044" name="Imagen 12"/>
@@ -8915,13 +8210,7 @@
               <w:rPr>
                 <w:sz w:val="18"/>
               </w:rPr>
-              <w:t xml:space="preserve">Creación de la aplicación gráfica </w:t>
-            </w:r>
-            <w:r>
-              <w:rPr>
-                <w:sz w:val="18"/>
-              </w:rPr>
-              <w:t>de escritorio.</w:t>
+              <w:t>Creación de la aplicación gráfica de escritorio.</w:t>
             </w:r>
           </w:p>
         </w:tc>
@@ -9193,13 +8482,7 @@
               <w:rPr>
                 <w:sz w:val="18"/>
               </w:rPr>
-              <w:t>Impresión de c</w:t>
-            </w:r>
-            <w:r>
-              <w:rPr>
-                <w:sz w:val="18"/>
-              </w:rPr>
-              <w:t>omprobantes mediante PrintDocument.</w:t>
+              <w:t>Impresión de comprobantes mediante PrintDocument.</w:t>
             </w:r>
           </w:p>
         </w:tc>
@@ -9212,6 +8495,7 @@
       </w:pPr>
       <w:bookmarkStart w:id="18" w:name="_Toc233562659"/>
       <w:r>
+        <w:lastRenderedPageBreak/>
         <w:t>16. Aporte de cada integrante del equipo</w:t>
       </w:r>
       <w:bookmarkEnd w:id="18"/>
@@ -9321,13 +8605,7 @@
               <w:rPr>
                 <w:sz w:val="18"/>
               </w:rPr>
-              <w:t xml:space="preserve">Implementación de partes complejas, validaciones, refuerzo del Tema H, </w:t>
-            </w:r>
-            <w:r>
-              <w:rPr>
-                <w:sz w:val="18"/>
-              </w:rPr>
-              <w:t>lógica de impresión y ajustes técnicos de la aplicación.</w:t>
+              <w:t>Implementación de partes complejas, validaciones, refuerzo del Tema H, lógica de impresión y ajustes técnicos de la aplicación.</w:t>
             </w:r>
           </w:p>
         </w:tc>
@@ -9458,13 +8736,7 @@
               <w:rPr>
                 <w:sz w:val="18"/>
               </w:rPr>
-              <w:t>Davi</w:t>
-            </w:r>
-            <w:r>
-              <w:rPr>
-                <w:sz w:val="18"/>
-              </w:rPr>
-              <w:t>s Batista</w:t>
+              <w:t>Davis Batista</w:t>
             </w:r>
           </w:p>
         </w:tc>
@@ -9517,10 +8789,7 @@
         <w:jc w:val="both"/>
       </w:pPr>
       <w:r>
-        <w:t>Durante el desarrollo se reforzó la importancia de organizar el código por responsabilidades. Uno de los principales retos fue mantener una aplicación visualmente moderna sin perder claridad en la estructura del código. También fue necesario reforzar las validaciones para evitar que los formularios enviaran datos inv</w:t>
-      </w:r>
-      <w:r>
-        <w:t>álidos a los servicios o repositorios.</w:t>
+        <w:t>Durante el desarrollo se reforzó la importancia de organizar el código por responsabilidades. Uno de los principales retos fue mantener una aplicación visualmente moderna sin perder claridad en la estructura del código. También fue necesario reforzar las validaciones para evitar que los formularios enviaran datos inválidos a los servicios o repositorios.</w:t>
       </w:r>
     </w:p>
     <w:p>
@@ -9538,10 +8807,7 @@
         <w:jc w:val="both"/>
       </w:pPr>
       <w:r>
-        <w:t>El aprendizaje principal fue comprender que un sistema gráfico no debe depender solo de la interfaz. La calidad del proyecto mejora</w:t>
-      </w:r>
-      <w:r>
-        <w:t xml:space="preserve"> cuando existen clases, campos privados, propiedades con validación, servicios, repositorios y documentación que explique cómo funciona cada parte.</w:t>
+        <w:t>El aprendizaje principal fue comprender que un sistema gráfico no debe depender solo de la interfaz. La calidad del proyecto mejora cuando existen clases, campos privados, propiedades con validación, servicios, repositorios y documentación que explique cómo funciona cada parte.</w:t>
       </w:r>
     </w:p>
     <w:p>
@@ -9560,10 +8826,7 @@
         <w:jc w:val="both"/>
       </w:pPr>
       <w:r>
-        <w:t>El proyecto NomiCore permitió aplicar los conocimientos de Lenguaje de Programación I en una solución de escritorio funcional. La aplicación resuelve un problema administrativo concreto relacionado con empleados, asistencia, nómina, comprobantes y reportes. Además, demuestra Programación Orientada a Objetos mediante clases, campos priva</w:t>
-      </w:r>
-      <w:r>
-        <w:t>dos, propiedades, validaciones, servicios y separación de responsabilidades.</w:t>
+        <w:t>El proyecto NomiCore permitió aplicar los conocimientos de Lenguaje de Programación I en una solución de escritorio funcional. La aplicación resuelve un problema administrativo concreto relacionado con empleados, asistencia, nómina, comprobantes y reportes. Además, demuestra Programación Orientada a Objetos mediante clases, campos privados, propiedades, validaciones, servicios y separación de responsabilidades.</w:t>
       </w:r>
     </w:p>
     <w:p>
@@ -9657,35 +8920,7 @@
         <w:rPr>
           <w:lang w:val="es-MX"/>
         </w:rPr>
-        <w:t xml:space="preserve">Se recomienda conservar el uso de </w:t>
-      </w:r>
-      <w:proofErr w:type="spellStart"/>
-      <w:r>
-        <w:rPr>
-          <w:lang w:val="es-MX"/>
-        </w:rPr>
-        <w:t>PrintDocument</w:t>
-      </w:r>
-      <w:proofErr w:type="spellEnd"/>
-      <w:r>
-        <w:rPr>
-          <w:lang w:val="es-MX"/>
-        </w:rPr>
-        <w:t xml:space="preserve"> junto con una vista previa de impresión mediante </w:t>
-      </w:r>
-      <w:proofErr w:type="spellStart"/>
-      <w:r>
-        <w:rPr>
-          <w:lang w:val="es-MX"/>
-        </w:rPr>
-        <w:t>PrintPreviewDialog</w:t>
-      </w:r>
-      <w:proofErr w:type="spellEnd"/>
-      <w:r>
-        <w:rPr>
-          <w:lang w:val="es-MX"/>
-        </w:rPr>
-        <w:t>. Esto permite revisar el comprobante antes de imprimirlo y reduce errores en la generación de documentos físicos. Además, mejora la experiencia del usuario porque no obliga a imprimir directamente sin verificar el contenido.</w:t>
+        <w:t>Se recomienda conservar el uso de PrintDocument junto con una vista previa de impresión mediante PrintPreviewDialog. Esto permite revisar el comprobante antes de imprimirlo y reduce errores en la generación de documentos físicos. Además, mejora la experiencia del usuario porque no obliga a imprimir directamente sin verificar el contenido.</w:t>
       </w:r>
     </w:p>
     <w:p>
@@ -9700,7 +8935,14 @@
         <w:rPr>
           <w:lang w:val="es-MX"/>
         </w:rPr>
-        <w:t>En futuras versiones, sería recomendable agregar un sistema de respaldo de la base de datos. La información de nómina es sensible e importante, por lo que el sistema debería permitir crear copias de seguridad periódicas para evitar pérdida de datos por fallos del equipo, eliminación accidental o daños en el archivo de base de datos.</w:t>
+        <w:t xml:space="preserve">En futuras versiones, sería recomendable agregar un sistema de respaldo de la base de datos. La información de nómina es sensible e importante, por lo que el sistema debería permitir crear copias de </w:t>
+      </w:r>
+      <w:r>
+        <w:rPr>
+          <w:lang w:val="es-MX"/>
+        </w:rPr>
+        <w:lastRenderedPageBreak/>
+        <w:t>seguridad periódicas para evitar pérdida de datos por fallos del equipo, eliminación accidental o daños en el archivo de base de datos.</w:t>
       </w:r>
     </w:p>
     <w:p>
@@ -9751,17 +8993,9 @@
         <w:rPr>
           <w:lang w:val="en-US"/>
         </w:rPr>
-        <w:t xml:space="preserve">20. </w:t>
-      </w:r>
-      <w:proofErr w:type="spellStart"/>
-      <w:r>
-        <w:rPr>
-          <w:lang w:val="en-US"/>
-        </w:rPr>
-        <w:t>Referencias</w:t>
+        <w:t>20. Referencias</w:t>
       </w:r>
       <w:bookmarkEnd w:id="22"/>
-      <w:proofErr w:type="spellEnd"/>
     </w:p>
     <w:p>
       <w:pPr>
@@ -9796,13 +9030,7 @@
         <w:rPr>
           <w:lang w:val="en-US"/>
         </w:rPr>
-        <w:t xml:space="preserve">• </w:t>
-      </w:r>
-      <w:r>
-        <w:rPr>
-          <w:lang w:val="en-US"/>
-        </w:rPr>
-        <w:t>Microsoft. (2025). Object-Oriented programming (C#). Microsoft Learn. https://learn.microsoft.com/en-us/dotnet/csharp/fundamentals/tutorials/oop</w:t>
+        <w:t>• Microsoft. (2025). Object-Oriented programming (C#). Microsoft Learn. https://learn.microsoft.com/en-us/dotnet/csharp/fundamentals/tutorials/oop</w:t>
       </w:r>
     </w:p>
     <w:p>
@@ -9817,21 +9045,7 @@
         <w:rPr>
           <w:lang w:val="en-US"/>
         </w:rPr>
-        <w:t xml:space="preserve">• Microsoft. (2025). </w:t>
-      </w:r>
-      <w:proofErr w:type="spellStart"/>
-      <w:r>
-        <w:rPr>
-          <w:lang w:val="en-US"/>
-        </w:rPr>
-        <w:t>PrintDocument</w:t>
-      </w:r>
-      <w:proofErr w:type="spellEnd"/>
-      <w:r>
-        <w:rPr>
-          <w:lang w:val="en-US"/>
-        </w:rPr>
-        <w:t xml:space="preserve"> Component - Windows Forms. Microsoft Learn. https://learn.microsoft.com/en-us/dotnet/desktop/winforms/controls/printdocument-component-windows-forms</w:t>
+        <w:t>• Microsoft. (2025). PrintDocument Component - Windows Forms. Microsoft Learn. https://learn.microsoft.com/en-us/dotnet/desktop/winforms/controls/printdocument-component-windows-forms</w:t>
       </w:r>
     </w:p>
     <w:p>
@@ -9846,23 +9060,7 @@
         <w:rPr>
           <w:lang w:val="en-US"/>
         </w:rPr>
-        <w:t xml:space="preserve">• Microsoft. (2025). </w:t>
-      </w:r>
-      <w:proofErr w:type="spellStart"/>
-      <w:proofErr w:type="gramStart"/>
-      <w:r>
-        <w:rPr>
-          <w:lang w:val="en-US"/>
-        </w:rPr>
-        <w:t>System.Drawing.Printing</w:t>
-      </w:r>
-      <w:proofErr w:type="spellEnd"/>
-      <w:proofErr w:type="gramEnd"/>
-      <w:r>
-        <w:rPr>
-          <w:lang w:val="en-US"/>
-        </w:rPr>
-        <w:t xml:space="preserve"> Namespace. Microsoft Learn. https://learn.microsoft.com/en-us/dotnet/api/system.drawing.printing</w:t>
+        <w:t>• Microsoft. (2025). System.Drawing.Printing Namespace. Microsoft Learn. https://learn.microsoft.com/en-us/dotnet/api/system.drawing.printing</w:t>
       </w:r>
     </w:p>
     <w:p>
@@ -9877,27 +9075,7 @@
         <w:rPr>
           <w:lang w:val="en-US"/>
         </w:rPr>
-        <w:t xml:space="preserve">• Microsoft. (2025). </w:t>
-      </w:r>
-      <w:proofErr w:type="spellStart"/>
-      <w:r>
-        <w:rPr>
-          <w:lang w:val="en-US"/>
-        </w:rPr>
-        <w:t>PrintDialog</w:t>
-      </w:r>
-      <w:proofErr w:type="spellEnd"/>
-      <w:r>
-        <w:rPr>
-          <w:lang w:val="en-US"/>
-        </w:rPr>
-        <w:t xml:space="preserve"> componen</w:t>
-      </w:r>
-      <w:r>
-        <w:rPr>
-          <w:lang w:val="en-US"/>
-        </w:rPr>
-        <w:t>t overview - Windows Forms. Microsoft Learn. https://learn.microsoft.com/en-us/dotnet/desktop/winforms/printing/overview</w:t>
+        <w:t>• Microsoft. (2025). PrintDialog component overview - Windows Forms. Microsoft Learn. https://learn.microsoft.com/en-us/dotnet/desktop/winforms/printing/overview</w:t>
       </w:r>
     </w:p>
     <w:p>
@@ -9930,10 +9108,7 @@
         <w:ind w:left="360"/>
       </w:pPr>
       <w:r>
-        <w:t>• Proyecto NomiCore. (2026). Documentación interna: ANALISIS_GUIA.md, Datos_Prueba.md, SUSTENTAC</w:t>
-      </w:r>
-      <w:r>
-        <w:t>ION.md y código fuente de SistemaGestionNomina.</w:t>
+        <w:t>• Proyecto NomiCore. (2026). Documentación interna: ANALISIS_GUIA.md, Datos_Prueba.md, SUSTENTACION.md y código fuente de SistemaGestionNomina.</w:t>
       </w:r>
     </w:p>
     <w:p>
@@ -13278,6 +12453,7 @@
   <w:style w:type="character" w:default="1" w:styleId="Fuentedeprrafopredeter">
     <w:name w:val="Default Paragraph Font"/>
     <w:uiPriority w:val="1"/>
+    <w:semiHidden/>
     <w:unhideWhenUsed/>
   </w:style>
   <w:style w:type="table" w:default="1" w:styleId="Tablanormal">
@@ -13815,9 +12991,12 @@
 </file>
 
 <file path=customXml/item2.xml><?xml version="1.0" encoding="utf-8"?>
-<p:properties xmlns:p="http://schemas.microsoft.com/office/2006/metadata/properties" xmlns:xsi="http://www.w3.org/2001/XMLSchema-instance" xmlns:pc="http://schemas.microsoft.com/office/infopath/2007/PartnerControls">
-  <documentManagement/>
-</p:properties>
+<?mso-contentType ?>
+<FormTemplates xmlns="http://schemas.microsoft.com/sharepoint/v3/contenttype/forms">
+  <Display>DocumentLibraryForm</Display>
+  <Edit>DocumentLibraryForm</Edit>
+  <New>DocumentLibraryForm</New>
+</FormTemplates>
 </file>
 
 <file path=customXml/item3.xml><?xml version="1.0" encoding="utf-8"?>
@@ -13959,12 +13138,9 @@
 </file>
 
 <file path=customXml/item4.xml><?xml version="1.0" encoding="utf-8"?>
-<?mso-contentType ?>
-<FormTemplates xmlns="http://schemas.microsoft.com/sharepoint/v3/contenttype/forms">
-  <Display>DocumentLibraryForm</Display>
-  <Edit>DocumentLibraryForm</Edit>
-  <New>DocumentLibraryForm</New>
-</FormTemplates>
+<p:properties xmlns:p="http://schemas.microsoft.com/office/2006/metadata/properties" xmlns:xsi="http://www.w3.org/2001/XMLSchema-instance" xmlns:pc="http://schemas.microsoft.com/office/infopath/2007/PartnerControls">
+  <documentManagement/>
+</p:properties>
 </file>
 
 <file path=customXml/itemProps1.xml><?xml version="1.0" encoding="utf-8"?>
@@ -13976,10 +13152,9 @@
 </file>
 
 <file path=customXml/itemProps2.xml><?xml version="1.0" encoding="utf-8"?>
-<ds:datastoreItem xmlns:ds="http://schemas.openxmlformats.org/officeDocument/2006/customXml" ds:itemID="{60EC212E-ECC9-40CA-A0B0-E0D18F17F066}">
+<ds:datastoreItem xmlns:ds="http://schemas.openxmlformats.org/officeDocument/2006/customXml" ds:itemID="{4C06D3A2-3CD2-4251-A305-3E1923FD1A0B}">
   <ds:schemaRefs>
-    <ds:schemaRef ds:uri="http://schemas.microsoft.com/office/2006/metadata/properties"/>
-    <ds:schemaRef ds:uri="http://schemas.microsoft.com/office/infopath/2007/PartnerControls"/>
+    <ds:schemaRef ds:uri="http://schemas.microsoft.com/sharepoint/v3/contenttype/forms"/>
   </ds:schemaRefs>
 </ds:datastoreItem>
 </file>
@@ -14003,9 +13178,10 @@
 </file>
 
 <file path=customXml/itemProps4.xml><?xml version="1.0" encoding="utf-8"?>
-<ds:datastoreItem xmlns:ds="http://schemas.openxmlformats.org/officeDocument/2006/customXml" ds:itemID="{4C06D3A2-3CD2-4251-A305-3E1923FD1A0B}">
+<ds:datastoreItem xmlns:ds="http://schemas.openxmlformats.org/officeDocument/2006/customXml" ds:itemID="{60EC212E-ECC9-40CA-A0B0-E0D18F17F066}">
   <ds:schemaRefs>
-    <ds:schemaRef ds:uri="http://schemas.microsoft.com/sharepoint/v3/contenttype/forms"/>
+    <ds:schemaRef ds:uri="http://schemas.microsoft.com/office/2006/metadata/properties"/>
+    <ds:schemaRef ds:uri="http://schemas.microsoft.com/office/infopath/2007/PartnerControls"/>
   </ds:schemaRefs>
 </ds:datastoreItem>
 </file>
</xml_diff>